<commit_message>
feat: group conference presentations by presenting role
Split the conference list into presentations Ingyu Yoo presented and
those he co-authored, so the record of his own talks reads first.

- As Presenter (first author): grouped Invited Talk, then Oral, then
  Poster; no poster entries currently qualify. Newest first within each
  group. The per-entry type tag is dropped here since the group heading
  already carries it.
- As Co-author: the remaining five entries, newest first, keeping their
  type tags because the group mixes oral and poster.
- Upcoming: unchanged, still last.

All 13 conference entries and 2 upcoming entries are preserved. Applied
to both publications.html and the CV docx/PDF.

Co-Authored-By: Claude Opus 5 <noreply@anthropic.com>
</commit_message>
<xml_diff>
--- a/CV_Ingyu_Yoo.docx
+++ b/CV_Ingyu_Yoo.docx
@@ -1384,6 +1384,40 @@
     </w:p>
     <w:p>
       <w:pPr>
+        <w:spacing w:before="140" w:after="60"/>
+      </w:pPr>
+      <w:r>
+        <w:rPr>
+          <w:b/>
+          <w:bCs/>
+          <w:color w:val="595959"/>
+          <w:spacing w:val="20"/>
+          <w:sz w:val="18"/>
+          <w:szCs w:val="18"/>
+        </w:rPr>
+        <w:t>AS PRESENTER</w:t>
+      </w:r>
+    </w:p>
+    <w:p>
+      <w:pPr>
+        <w:spacing w:before="140" w:after="60"/>
+        <w:ind w:left="200"/>
+      </w:pPr>
+      <w:r>
+        <w:rPr>
+          <w:b/>
+          <w:bCs/>
+          <w:i/>
+          <w:color w:val="595959"/>
+          <w:spacing w:val="20"/>
+          <w:sz w:val="18"/>
+          <w:szCs w:val="18"/>
+        </w:rPr>
+        <w:t>Invited Talk</w:t>
+      </w:r>
+    </w:p>
+    <w:p>
+      <w:pPr>
         <w:pStyle w:val="a4"/>
         <w:numPr>
           <w:ilvl w:val="0"/>
@@ -1391,13 +1425,15 @@
         </w:numPr>
         <w:spacing w:after="46" w:line="248" w:lineRule="auto"/>
         <w:jc w:val="both"/>
-      </w:pPr>
-      <w:r>
-        <w:rPr>
-          <w:sz w:val="19"/>
-          <w:szCs w:val="19"/>
-        </w:rPr>
-        <w:t xml:space="preserve">(Poster) Ryu, J., S. Lee, S. Kim, </w:t>
+        <w:rPr>
+          <w:rFonts w:hint="eastAsia"/>
+        </w:rPr>
+      </w:pPr>
+      <w:r>
+        <w:rPr>
+          <w:sz w:val="19"/>
+          <w:szCs w:val="19"/>
+        </w:rPr>
       </w:r>
       <w:r>
         <w:rPr>
@@ -1407,14 +1443,111 @@
           <w:sz w:val="19"/>
           <w:szCs w:val="19"/>
         </w:rPr>
-        <w:t>I. Yoo</w:t>
-      </w:r>
-      <w:r>
-        <w:rPr>
-          <w:sz w:val="19"/>
-          <w:szCs w:val="19"/>
-        </w:rPr>
-        <w:t>, Y.-C. Joo, M. Kim*, “A machine-learning approach to characterization of amorphous materials with EELS-SI and 4D-STEM”, 2022 Materials Research Society Spring Meeting, Hawaii, USA (2022)</w:t>
+        <w:t>Ingyu Yoo</w:t>
+      </w:r>
+      <w:r>
+        <w:rPr>
+          <w:sz w:val="19"/>
+          <w:szCs w:val="19"/>
+        </w:rPr>
+        <w:t xml:space="preserve">, </w:t>
+      </w:r>
+      <w:proofErr w:type="spellStart"/>
+      <w:r>
+        <w:rPr>
+          <w:sz w:val="19"/>
+          <w:szCs w:val="19"/>
+        </w:rPr>
+        <w:t>Yunyeong</w:t>
+      </w:r>
+      <w:proofErr w:type="spellEnd"/>
+      <w:r>
+        <w:rPr>
+          <w:sz w:val="19"/>
+          <w:szCs w:val="19"/>
+        </w:rPr>
+        <w:t xml:space="preserve"> Chang, </w:t>
+      </w:r>
+      <w:proofErr w:type="spellStart"/>
+      <w:r>
+        <w:rPr>
+          <w:sz w:val="19"/>
+          <w:szCs w:val="19"/>
+        </w:rPr>
+        <w:t>Jinseok</w:t>
+      </w:r>
+      <w:proofErr w:type="spellEnd"/>
+      <w:r>
+        <w:rPr>
+          <w:sz w:val="19"/>
+          <w:szCs w:val="19"/>
+        </w:rPr>
+        <w:t xml:space="preserve"> Ryu, Jinwoo Kim, Seong Chul Hong, Ji-Hwan Baek, </w:t>
+      </w:r>
+      <w:proofErr w:type="spellStart"/>
+      <w:r>
+        <w:rPr>
+          <w:sz w:val="19"/>
+          <w:szCs w:val="19"/>
+        </w:rPr>
+        <w:t>Jaewoong</w:t>
+      </w:r>
+      <w:proofErr w:type="spellEnd"/>
+      <w:r>
+        <w:rPr>
+          <w:sz w:val="19"/>
+          <w:szCs w:val="19"/>
+        </w:rPr>
+        <w:t xml:space="preserve"> Joo, Jian-min Zuo, </w:t>
+      </w:r>
+      <w:proofErr w:type="spellStart"/>
+      <w:r>
+        <w:rPr>
+          <w:sz w:val="19"/>
+          <w:szCs w:val="19"/>
+        </w:rPr>
+        <w:t>Hyobin</w:t>
+      </w:r>
+      <w:proofErr w:type="spellEnd"/>
+      <w:r>
+        <w:rPr>
+          <w:sz w:val="19"/>
+          <w:szCs w:val="19"/>
+        </w:rPr>
+        <w:t xml:space="preserve"> Yoo, Gwan-Hyoung Lee,</w:t>
+      </w:r>
+      <w:r>
+        <w:rPr>
+          <w:rFonts w:hint="eastAsia"/>
+          <w:sz w:val="19"/>
+          <w:szCs w:val="19"/>
+        </w:rPr>
+        <w:t xml:space="preserve"> </w:t>
+      </w:r>
+      <w:r>
+        <w:rPr>
+          <w:sz w:val="19"/>
+          <w:szCs w:val="19"/>
+        </w:rPr>
+        <w:t>Miyoung Kim*, “Interlayer lattice relaxation and moiré structural evolution in TMDs”, The 21th International Microscopy Congress, Liverpool, United Kingdom (2026)</w:t>
+      </w:r>
+    </w:p>
+    <w:p>
+      <w:pPr>
+        <w:spacing w:before="140" w:after="60"/>
+        <w:ind w:left="200"/>
+      </w:pPr>
+      <w:r>
+        <w:rPr>
+          <w:b/>
+          <w:bCs/>
+          <w:i/>
+          <w:color w:val="595959"/>
+          <w:spacing w:val="20"/>
+          <w:sz w:val="18"/>
+          <w:szCs w:val="18"/>
+        </w:rPr>
+        <w:t>Oral</w:t>
       </w:r>
     </w:p>
     <w:p>
@@ -1432,23 +1565,6 @@
           <w:sz w:val="19"/>
           <w:szCs w:val="19"/>
         </w:rPr>
-        <w:t xml:space="preserve">(Oral) </w:t>
-      </w:r>
-      <w:proofErr w:type="spellStart"/>
-      <w:r>
-        <w:rPr>
-          <w:sz w:val="19"/>
-          <w:szCs w:val="19"/>
-        </w:rPr>
-        <w:t>Yunyeong</w:t>
-      </w:r>
-      <w:proofErr w:type="spellEnd"/>
-      <w:r>
-        <w:rPr>
-          <w:sz w:val="19"/>
-          <w:szCs w:val="19"/>
-        </w:rPr>
-        <w:t xml:space="preserve"> Chang, </w:t>
       </w:r>
       <w:r>
         <w:rPr>
@@ -1465,23 +1581,55 @@
           <w:sz w:val="19"/>
           <w:szCs w:val="19"/>
         </w:rPr>
-        <w:t xml:space="preserve">, Ayoung Yuk, </w:t>
-      </w:r>
-      <w:proofErr w:type="spellStart"/>
-      <w:r>
-        <w:rPr>
-          <w:sz w:val="19"/>
-          <w:szCs w:val="19"/>
-        </w:rPr>
-        <w:t>Hyobin</w:t>
-      </w:r>
-      <w:proofErr w:type="spellEnd"/>
-      <w:r>
-        <w:rPr>
-          <w:sz w:val="19"/>
-          <w:szCs w:val="19"/>
-        </w:rPr>
-        <w:t xml:space="preserve"> Yoo, Miyoung Kim*, “Understanding Twisted Transition Metal Dichalcogenide Domain Node Atomic Transition”, 2022 Materials Research Society Spring Meeting, Hawaii, USA (2022)</w:t>
+        <w:t xml:space="preserve">, </w:t>
+      </w:r>
+      <w:proofErr w:type="spellStart"/>
+      <w:r>
+        <w:rPr>
+          <w:sz w:val="19"/>
+          <w:szCs w:val="19"/>
+        </w:rPr>
+        <w:t>Hangyel</w:t>
+      </w:r>
+      <w:proofErr w:type="spellEnd"/>
+      <w:r>
+        <w:rPr>
+          <w:sz w:val="19"/>
+          <w:szCs w:val="19"/>
+        </w:rPr>
+        <w:t xml:space="preserve"> Kim, </w:t>
+      </w:r>
+      <w:proofErr w:type="spellStart"/>
+      <w:r>
+        <w:rPr>
+          <w:sz w:val="19"/>
+          <w:szCs w:val="19"/>
+        </w:rPr>
+        <w:t>Pinshane</w:t>
+      </w:r>
+      <w:proofErr w:type="spellEnd"/>
+      <w:r>
+        <w:rPr>
+          <w:sz w:val="19"/>
+          <w:szCs w:val="19"/>
+        </w:rPr>
+        <w:t xml:space="preserve"> Y. Huang, Arend M. van der Zande*, Miyoung Kim*, “Atomic Reconstruction in a Single-Twist </w:t>
+      </w:r>
+      <w:proofErr w:type="spellStart"/>
+      <w:r>
+        <w:rPr>
+          <w:sz w:val="19"/>
+          <w:szCs w:val="19"/>
+        </w:rPr>
+        <w:t>Trilayer</w:t>
+      </w:r>
+      <w:proofErr w:type="spellEnd"/>
+      <w:r>
+        <w:rPr>
+          <w:sz w:val="19"/>
+          <w:szCs w:val="19"/>
+        </w:rPr>
+        <w:t xml:space="preserve"> MoS2 on a CVD-Grown Bilayer”, The 21th International Microscopy Congress, Liverpool, United Kingdom (2026)</w:t>
       </w:r>
     </w:p>
     <w:p>
@@ -1499,7 +1647,6 @@
           <w:sz w:val="19"/>
           <w:szCs w:val="19"/>
         </w:rPr>
-        <w:t xml:space="preserve">(Oral) </w:t>
       </w:r>
       <w:r>
         <w:rPr>
@@ -1524,31 +1671,15 @@
           <w:sz w:val="19"/>
           <w:szCs w:val="19"/>
         </w:rPr>
-        <w:t>Jusang</w:t>
-      </w:r>
-      <w:proofErr w:type="spellEnd"/>
-      <w:r>
-        <w:rPr>
-          <w:sz w:val="19"/>
-          <w:szCs w:val="19"/>
-        </w:rPr>
-        <w:t xml:space="preserve"> Lee, Gwan-Hyoung Lee, Miyoung Kim*, “Unraveling stacking </w:t>
-      </w:r>
-      <w:proofErr w:type="spellStart"/>
-      <w:r>
-        <w:rPr>
-          <w:sz w:val="19"/>
-          <w:szCs w:val="19"/>
-        </w:rPr>
-        <w:t>seqeunce</w:t>
-      </w:r>
-      <w:proofErr w:type="spellEnd"/>
-      <w:r>
-        <w:rPr>
-          <w:sz w:val="19"/>
-          <w:szCs w:val="19"/>
-        </w:rPr>
-        <w:t xml:space="preserve"> of WSe2 spiral structure using nanobeam diffraction”, The 20th International Microscopy Congress, Busan, South Korea (2023)</w:t>
+        <w:t>Jaewoong</w:t>
+      </w:r>
+      <w:proofErr w:type="spellEnd"/>
+      <w:r>
+        <w:rPr>
+          <w:sz w:val="19"/>
+          <w:szCs w:val="19"/>
+        </w:rPr>
+        <w:t xml:space="preserve"> Joo, Gwan-Hyoung Lee, Miyoung Kim*, “Deciphering Moiré Periodicity Modification in van der Waals Heterostructure”, Microscopy and Microanalysis 2025, Salt Lake City, USA (2025)</w:t>
       </w:r>
     </w:p>
     <w:p>
@@ -1566,7 +1697,6 @@
           <w:sz w:val="19"/>
           <w:szCs w:val="19"/>
         </w:rPr>
-        <w:t xml:space="preserve">(Oral) </w:t>
       </w:r>
       <w:r>
         <w:rPr>
@@ -1583,7 +1713,23 @@
           <w:sz w:val="19"/>
           <w:szCs w:val="19"/>
         </w:rPr>
-        <w:t>, Miyoung Kim*, “Diverse Stacking Sequences Discovery in Transition Metal Dichalcogenides (TMDs) through Diffraction Polarity Analysis”, The 2024 Annual Spring Conference of Korean Society of Microscopy, Hongcheon, South Korea (2024)</w:t>
+        <w:t xml:space="preserve">, Jinwoo Kim, </w:t>
+      </w:r>
+      <w:proofErr w:type="spellStart"/>
+      <w:r>
+        <w:rPr>
+          <w:sz w:val="19"/>
+          <w:szCs w:val="19"/>
+        </w:rPr>
+        <w:t>Jaewoong</w:t>
+      </w:r>
+      <w:proofErr w:type="spellEnd"/>
+      <w:r>
+        <w:rPr>
+          <w:sz w:val="19"/>
+          <w:szCs w:val="19"/>
+        </w:rPr>
+        <w:t xml:space="preserve"> Joo, Gwan-Hyoung Lee, Miyoung Kim*, “Structural Responses to Interlayer Coupling in Aligned Heterostructure”, 13th Asia-Pacific Microscopy Congress, Brisbane, Australia (2025)</w:t>
       </w:r>
     </w:p>
     <w:p>
@@ -1601,7 +1747,23 @@
           <w:sz w:val="19"/>
           <w:szCs w:val="19"/>
         </w:rPr>
-        <w:t xml:space="preserve">(Poster) </w:t>
+      </w:r>
+      <w:r>
+        <w:rPr>
+          <w:b/>
+          <w:bCs/>
+          <w:color w:val="1A1A1A"/>
+          <w:sz w:val="19"/>
+          <w:szCs w:val="19"/>
+        </w:rPr>
+        <w:t>Ingyu Yoo</w:t>
+      </w:r>
+      <w:r>
+        <w:rPr>
+          <w:sz w:val="19"/>
+          <w:szCs w:val="19"/>
+        </w:rPr>
+        <w:t xml:space="preserve">, </w:t>
       </w:r>
       <w:proofErr w:type="spellStart"/>
       <w:r>
@@ -1625,96 +1787,15 @@
           <w:sz w:val="19"/>
           <w:szCs w:val="19"/>
         </w:rPr>
-        <w:t>Sehwan</w:t>
-      </w:r>
-      <w:proofErr w:type="spellEnd"/>
-      <w:r>
-        <w:rPr>
-          <w:sz w:val="19"/>
-          <w:szCs w:val="19"/>
-        </w:rPr>
-        <w:t xml:space="preserve"> Song, </w:t>
-      </w:r>
-      <w:proofErr w:type="spellStart"/>
-      <w:r>
-        <w:rPr>
-          <w:sz w:val="19"/>
-          <w:szCs w:val="19"/>
-        </w:rPr>
-        <w:t>Hyeonyu</w:t>
-      </w:r>
-      <w:proofErr w:type="spellEnd"/>
-      <w:r>
-        <w:rPr>
-          <w:sz w:val="19"/>
-          <w:szCs w:val="19"/>
-        </w:rPr>
-        <w:t xml:space="preserve"> Kim, </w:t>
-      </w:r>
-      <w:r>
-        <w:rPr>
-          <w:b/>
-          <w:bCs/>
-          <w:color w:val="1A1A1A"/>
-          <w:sz w:val="19"/>
-          <w:szCs w:val="19"/>
-        </w:rPr>
-        <w:t>Ingyu Yoo</w:t>
-      </w:r>
-      <w:r>
-        <w:rPr>
-          <w:sz w:val="19"/>
-          <w:szCs w:val="19"/>
-        </w:rPr>
-        <w:t xml:space="preserve">, Sang Woon Hwang, </w:t>
-      </w:r>
-      <w:proofErr w:type="spellStart"/>
-      <w:r>
-        <w:rPr>
-          <w:sz w:val="19"/>
-          <w:szCs w:val="19"/>
-        </w:rPr>
-        <w:t>Sungkyun</w:t>
-      </w:r>
-      <w:proofErr w:type="spellEnd"/>
-      <w:r>
-        <w:rPr>
-          <w:sz w:val="19"/>
-          <w:szCs w:val="19"/>
-        </w:rPr>
-        <w:t xml:space="preserve"> Park, </w:t>
-      </w:r>
-      <w:proofErr w:type="spellStart"/>
-      <w:r>
-        <w:rPr>
-          <w:sz w:val="19"/>
-          <w:szCs w:val="19"/>
-        </w:rPr>
-        <w:t>Dooyong</w:t>
-      </w:r>
-      <w:proofErr w:type="spellEnd"/>
-      <w:r>
-        <w:rPr>
-          <w:sz w:val="19"/>
-          <w:szCs w:val="19"/>
-        </w:rPr>
-        <w:t xml:space="preserve"> Lee, </w:t>
-      </w:r>
-      <w:proofErr w:type="spellStart"/>
-      <w:r>
-        <w:rPr>
-          <w:sz w:val="19"/>
-          <w:szCs w:val="19"/>
-        </w:rPr>
-        <w:t>Sangmoon</w:t>
-      </w:r>
-      <w:proofErr w:type="spellEnd"/>
-      <w:r>
-        <w:rPr>
-          <w:sz w:val="19"/>
-          <w:szCs w:val="19"/>
-        </w:rPr>
-        <w:t xml:space="preserve"> Yoon, Miyoung Kim*, “Structural origins of magnetic property evolution in epitaxial ilmenite–hematite solid solutions”, The 2024 Annual Spring Conference of Korean Society of Microscopy, Gyeongju, South Korea (2024)</w:t>
+        <w:t>Jongho</w:t>
+      </w:r>
+      <w:proofErr w:type="spellEnd"/>
+      <w:r>
+        <w:rPr>
+          <w:sz w:val="19"/>
+          <w:szCs w:val="19"/>
+        </w:rPr>
+        <w:t xml:space="preserve"> Lee, Mireu Kim, Miyoung Kim*, “Quantitative Atomic Structure Analysis Using Saliency-Based Clustering in STEM”, 13th Asia-Pacific Microscopy Congress, Brisbane, Australia (2025)</w:t>
       </w:r>
     </w:p>
     <w:p>
@@ -1732,7 +1813,6 @@
           <w:sz w:val="19"/>
           <w:szCs w:val="19"/>
         </w:rPr>
-        <w:t xml:space="preserve">(Oral) </w:t>
       </w:r>
       <w:r>
         <w:rPr>
@@ -1767,7 +1847,6 @@
           <w:sz w:val="19"/>
           <w:szCs w:val="19"/>
         </w:rPr>
-        <w:t xml:space="preserve">(Oral) </w:t>
       </w:r>
       <w:r>
         <w:rPr>
@@ -1784,23 +1863,7 @@
           <w:sz w:val="19"/>
           <w:szCs w:val="19"/>
         </w:rPr>
-        <w:t xml:space="preserve">, Jinwoo Kim, </w:t>
-      </w:r>
-      <w:proofErr w:type="spellStart"/>
-      <w:r>
-        <w:rPr>
-          <w:sz w:val="19"/>
-          <w:szCs w:val="19"/>
-        </w:rPr>
-        <w:t>Jaewoong</w:t>
-      </w:r>
-      <w:proofErr w:type="spellEnd"/>
-      <w:r>
-        <w:rPr>
-          <w:sz w:val="19"/>
-          <w:szCs w:val="19"/>
-        </w:rPr>
-        <w:t xml:space="preserve"> Joo, Gwan-Hyoung Lee, Miyoung Kim*, “Structural Responses to Interlayer Coupling in Aligned Heterostructure”, 13th Asia-Pacific Microscopy Congress, Brisbane, Australia (2025)</w:t>
+        <w:t>, Miyoung Kim*, “Diverse Stacking Sequences Discovery in Transition Metal Dichalcogenides (TMDs) through Diffraction Polarity Analysis”, The 2024 Annual Spring Conference of Korean Society of Microscopy, Hongcheon, South Korea (2024)</w:t>
       </w:r>
     </w:p>
     <w:p>
@@ -1818,8 +1881,6 @@
           <w:sz w:val="19"/>
           <w:szCs w:val="19"/>
         </w:rPr>
-        <w:lastRenderedPageBreak/>
-        <w:t xml:space="preserve">(Oral) </w:t>
       </w:r>
       <w:r>
         <w:rPr>
@@ -1836,39 +1897,55 @@
           <w:sz w:val="19"/>
           <w:szCs w:val="19"/>
         </w:rPr>
-        <w:t xml:space="preserve">, </w:t>
-      </w:r>
-      <w:proofErr w:type="spellStart"/>
-      <w:r>
-        <w:rPr>
-          <w:sz w:val="19"/>
-          <w:szCs w:val="19"/>
-        </w:rPr>
-        <w:t>Yoonsang</w:t>
-      </w:r>
-      <w:proofErr w:type="spellEnd"/>
-      <w:r>
-        <w:rPr>
-          <w:sz w:val="19"/>
-          <w:szCs w:val="19"/>
-        </w:rPr>
-        <w:t xml:space="preserve"> Tak, </w:t>
-      </w:r>
-      <w:proofErr w:type="spellStart"/>
-      <w:r>
-        <w:rPr>
-          <w:sz w:val="19"/>
-          <w:szCs w:val="19"/>
-        </w:rPr>
-        <w:t>Jongho</w:t>
-      </w:r>
-      <w:proofErr w:type="spellEnd"/>
-      <w:r>
-        <w:rPr>
-          <w:sz w:val="19"/>
-          <w:szCs w:val="19"/>
-        </w:rPr>
-        <w:t xml:space="preserve"> Lee, Mireu Kim, Miyoung Kim*, “Quantitative Atomic Structure Analysis Using Saliency-Based Clustering in STEM”, 13th Asia-Pacific Microscopy Congress, Brisbane, Australia (2025)</w:t>
+        <w:t xml:space="preserve">, Jinwoo Kim, </w:t>
+      </w:r>
+      <w:proofErr w:type="spellStart"/>
+      <w:r>
+        <w:rPr>
+          <w:sz w:val="19"/>
+          <w:szCs w:val="19"/>
+        </w:rPr>
+        <w:t>Jusang</w:t>
+      </w:r>
+      <w:proofErr w:type="spellEnd"/>
+      <w:r>
+        <w:rPr>
+          <w:sz w:val="19"/>
+          <w:szCs w:val="19"/>
+        </w:rPr>
+        <w:t xml:space="preserve"> Lee, Gwan-Hyoung Lee, Miyoung Kim*, “Unraveling stacking </w:t>
+      </w:r>
+      <w:proofErr w:type="spellStart"/>
+      <w:r>
+        <w:rPr>
+          <w:sz w:val="19"/>
+          <w:szCs w:val="19"/>
+        </w:rPr>
+        <w:t>seqeunce</w:t>
+      </w:r>
+      <w:proofErr w:type="spellEnd"/>
+      <w:r>
+        <w:rPr>
+          <w:sz w:val="19"/>
+          <w:szCs w:val="19"/>
+        </w:rPr>
+        <w:t xml:space="preserve"> of WSe2 spiral structure using nanobeam diffraction”, The 20th International Microscopy Congress, Busan, South Korea (2023)</w:t>
+      </w:r>
+    </w:p>
+    <w:p>
+      <w:pPr>
+        <w:spacing w:before="140" w:after="60"/>
+      </w:pPr>
+      <w:r>
+        <w:rPr>
+          <w:b/>
+          <w:bCs/>
+          <w:color w:val="595959"/>
+          <w:spacing w:val="20"/>
+          <w:sz w:val="18"/>
+          <w:szCs w:val="18"/>
+        </w:rPr>
+        <w:t>AS CO-AUTHOR</w:t>
       </w:r>
     </w:p>
     <w:p>
@@ -1886,7 +1963,7 @@
           <w:sz w:val="19"/>
           <w:szCs w:val="19"/>
         </w:rPr>
-        <w:t xml:space="preserve">(Poster) Jinwoo Kim, </w:t>
+        <w:t xml:space="preserve">(Poster) Eunseo Oh, </w:t>
       </w:r>
       <w:r>
         <w:rPr>
@@ -1911,15 +1988,47 @@
           <w:sz w:val="19"/>
           <w:szCs w:val="19"/>
         </w:rPr>
-        <w:t>Jaewoong</w:t>
-      </w:r>
-      <w:proofErr w:type="spellEnd"/>
-      <w:r>
-        <w:rPr>
-          <w:sz w:val="19"/>
-          <w:szCs w:val="19"/>
-        </w:rPr>
-        <w:t xml:space="preserve"> Joo, Miyoung Kim, Gwan-Hyoung Lee*, “Complex Strain Distribution in Van der Waals Epitaxy of Transition Metal Dichalcogenides Heterostructures with Lattice Mismatch”, 23rd International Nano Technology Exhibition, KINTEX, South Korea (2025)</w:t>
+        <w:t>Chanyoung</w:t>
+      </w:r>
+      <w:proofErr w:type="spellEnd"/>
+      <w:r>
+        <w:rPr>
+          <w:sz w:val="19"/>
+          <w:szCs w:val="19"/>
+        </w:rPr>
+        <w:t xml:space="preserve"> Shin, </w:t>
+      </w:r>
+      <w:proofErr w:type="spellStart"/>
+      <w:r>
+        <w:rPr>
+          <w:sz w:val="19"/>
+          <w:szCs w:val="19"/>
+        </w:rPr>
+        <w:t>Ahjeong</w:t>
+      </w:r>
+      <w:proofErr w:type="spellEnd"/>
+      <w:r>
+        <w:rPr>
+          <w:sz w:val="19"/>
+          <w:szCs w:val="19"/>
+        </w:rPr>
+        <w:t xml:space="preserve"> Lyu, </w:t>
+      </w:r>
+      <w:proofErr w:type="spellStart"/>
+      <w:r>
+        <w:rPr>
+          <w:sz w:val="19"/>
+          <w:szCs w:val="19"/>
+        </w:rPr>
+        <w:t>Kyuree</w:t>
+      </w:r>
+      <w:proofErr w:type="spellEnd"/>
+      <w:r>
+        <w:rPr>
+          <w:sz w:val="19"/>
+          <w:szCs w:val="19"/>
+        </w:rPr>
+        <w:t xml:space="preserve"> Kim, Miyoung Kim*, “Machine Learning-Based Quantitative Microstructure Analysis for Integrity Evaluation of IN718 Alloys”, The 2026 Annual Spring Conference of Korean Society of Microscopy, Daejeon, South Korea (2026)</w:t>
       </w:r>
     </w:p>
     <w:p>
@@ -1937,7 +2046,7 @@
           <w:sz w:val="19"/>
           <w:szCs w:val="19"/>
         </w:rPr>
-        <w:t xml:space="preserve">(Oral) </w:t>
+        <w:t xml:space="preserve">(Poster) Jinwoo Kim, </w:t>
       </w:r>
       <w:r>
         <w:rPr>
@@ -1954,7 +2063,7 @@
           <w:sz w:val="19"/>
           <w:szCs w:val="19"/>
         </w:rPr>
-        <w:t xml:space="preserve">, Jinwoo Kim, </w:t>
+        <w:t xml:space="preserve">, </w:t>
       </w:r>
       <w:proofErr w:type="spellStart"/>
       <w:r>
@@ -1970,7 +2079,7 @@
           <w:sz w:val="19"/>
           <w:szCs w:val="19"/>
         </w:rPr>
-        <w:t xml:space="preserve"> Joo, Gwan-Hyoung Lee, Miyoung Kim*, “Deciphering Moiré Periodicity Modification in van der Waals Heterostructure”, Microscopy and Microanalysis 2025, Salt Lake City, USA (2025)</w:t>
+        <w:t xml:space="preserve"> Joo, Miyoung Kim, Gwan-Hyoung Lee*, “Complex Strain Distribution in Van der Waals Epitaxy of Transition Metal Dichalcogenides Heterostructures with Lattice Mismatch”, 23rd International Nano Technology Exhibition, KINTEX, South Korea (2025)</w:t>
       </w:r>
     </w:p>
     <w:p>
@@ -1988,7 +2097,55 @@
           <w:sz w:val="19"/>
           <w:szCs w:val="19"/>
         </w:rPr>
-        <w:t xml:space="preserve">(Poster) Eunseo Oh, </w:t>
+        <w:t xml:space="preserve">(Poster) </w:t>
+      </w:r>
+      <w:proofErr w:type="spellStart"/>
+      <w:r>
+        <w:rPr>
+          <w:sz w:val="19"/>
+          <w:szCs w:val="19"/>
+        </w:rPr>
+        <w:t>Yoonsang</w:t>
+      </w:r>
+      <w:proofErr w:type="spellEnd"/>
+      <w:r>
+        <w:rPr>
+          <w:sz w:val="19"/>
+          <w:szCs w:val="19"/>
+        </w:rPr>
+        <w:t xml:space="preserve"> Tak, </w:t>
+      </w:r>
+      <w:proofErr w:type="spellStart"/>
+      <w:r>
+        <w:rPr>
+          <w:sz w:val="19"/>
+          <w:szCs w:val="19"/>
+        </w:rPr>
+        <w:t>Sehwan</w:t>
+      </w:r>
+      <w:proofErr w:type="spellEnd"/>
+      <w:r>
+        <w:rPr>
+          <w:sz w:val="19"/>
+          <w:szCs w:val="19"/>
+        </w:rPr>
+        <w:t xml:space="preserve"> Song, </w:t>
+      </w:r>
+      <w:proofErr w:type="spellStart"/>
+      <w:r>
+        <w:rPr>
+          <w:sz w:val="19"/>
+          <w:szCs w:val="19"/>
+        </w:rPr>
+        <w:t>Hyeonyu</w:t>
+      </w:r>
+      <w:proofErr w:type="spellEnd"/>
+      <w:r>
+        <w:rPr>
+          <w:sz w:val="19"/>
+          <w:szCs w:val="19"/>
+        </w:rPr>
+        <w:t xml:space="preserve"> Kim, </w:t>
       </w:r>
       <w:r>
         <w:rPr>
@@ -2005,55 +2162,55 @@
           <w:sz w:val="19"/>
           <w:szCs w:val="19"/>
         </w:rPr>
-        <w:t xml:space="preserve">, </w:t>
-      </w:r>
-      <w:proofErr w:type="spellStart"/>
-      <w:r>
-        <w:rPr>
-          <w:sz w:val="19"/>
-          <w:szCs w:val="19"/>
-        </w:rPr>
-        <w:t>Chanyoung</w:t>
-      </w:r>
-      <w:proofErr w:type="spellEnd"/>
-      <w:r>
-        <w:rPr>
-          <w:sz w:val="19"/>
-          <w:szCs w:val="19"/>
-        </w:rPr>
-        <w:t xml:space="preserve"> Shin, </w:t>
-      </w:r>
-      <w:proofErr w:type="spellStart"/>
-      <w:r>
-        <w:rPr>
-          <w:sz w:val="19"/>
-          <w:szCs w:val="19"/>
-        </w:rPr>
-        <w:t>Ahjeong</w:t>
-      </w:r>
-      <w:proofErr w:type="spellEnd"/>
-      <w:r>
-        <w:rPr>
-          <w:sz w:val="19"/>
-          <w:szCs w:val="19"/>
-        </w:rPr>
-        <w:t xml:space="preserve"> Lyu, </w:t>
-      </w:r>
-      <w:proofErr w:type="spellStart"/>
-      <w:r>
-        <w:rPr>
-          <w:sz w:val="19"/>
-          <w:szCs w:val="19"/>
-        </w:rPr>
-        <w:t>Kyuree</w:t>
-      </w:r>
-      <w:proofErr w:type="spellEnd"/>
-      <w:r>
-        <w:rPr>
-          <w:sz w:val="19"/>
-          <w:szCs w:val="19"/>
-        </w:rPr>
-        <w:t xml:space="preserve"> Kim, Miyoung Kim*, “Machine Learning-Based Quantitative Microstructure Analysis for Integrity Evaluation of IN718 Alloys”, The 2026 Annual Spring Conference of Korean Society of Microscopy, Daejeon, South Korea (2026)</w:t>
+        <w:t xml:space="preserve">, Sang Woon Hwang, </w:t>
+      </w:r>
+      <w:proofErr w:type="spellStart"/>
+      <w:r>
+        <w:rPr>
+          <w:sz w:val="19"/>
+          <w:szCs w:val="19"/>
+        </w:rPr>
+        <w:t>Sungkyun</w:t>
+      </w:r>
+      <w:proofErr w:type="spellEnd"/>
+      <w:r>
+        <w:rPr>
+          <w:sz w:val="19"/>
+          <w:szCs w:val="19"/>
+        </w:rPr>
+        <w:t xml:space="preserve"> Park, </w:t>
+      </w:r>
+      <w:proofErr w:type="spellStart"/>
+      <w:r>
+        <w:rPr>
+          <w:sz w:val="19"/>
+          <w:szCs w:val="19"/>
+        </w:rPr>
+        <w:t>Dooyong</w:t>
+      </w:r>
+      <w:proofErr w:type="spellEnd"/>
+      <w:r>
+        <w:rPr>
+          <w:sz w:val="19"/>
+          <w:szCs w:val="19"/>
+        </w:rPr>
+        <w:t xml:space="preserve"> Lee, </w:t>
+      </w:r>
+      <w:proofErr w:type="spellStart"/>
+      <w:r>
+        <w:rPr>
+          <w:sz w:val="19"/>
+          <w:szCs w:val="19"/>
+        </w:rPr>
+        <w:t>Sangmoon</w:t>
+      </w:r>
+      <w:proofErr w:type="spellEnd"/>
+      <w:r>
+        <w:rPr>
+          <w:sz w:val="19"/>
+          <w:szCs w:val="19"/>
+        </w:rPr>
+        <w:t xml:space="preserve"> Yoon, Miyoung Kim*, “Structural origins of magnetic property evolution in epitaxial ilmenite–hematite solid solutions”, The 2024 Annual Spring Conference of Korean Society of Microscopy, Gyeongju, South Korea (2024)</w:t>
       </w:r>
     </w:p>
     <w:p>
@@ -2071,7 +2228,7 @@
           <w:sz w:val="19"/>
           <w:szCs w:val="19"/>
         </w:rPr>
-        <w:t xml:space="preserve">(Oral) </w:t>
+        <w:t xml:space="preserve">(Poster) Ryu, J., S. Lee, S. Kim, </w:t>
       </w:r>
       <w:r>
         <w:rPr>
@@ -2081,62 +2238,14 @@
           <w:sz w:val="19"/>
           <w:szCs w:val="19"/>
         </w:rPr>
-        <w:t>Ingyu Yoo</w:t>
-      </w:r>
-      <w:r>
-        <w:rPr>
-          <w:sz w:val="19"/>
-          <w:szCs w:val="19"/>
-        </w:rPr>
-        <w:t xml:space="preserve">, </w:t>
-      </w:r>
-      <w:proofErr w:type="spellStart"/>
-      <w:r>
-        <w:rPr>
-          <w:sz w:val="19"/>
-          <w:szCs w:val="19"/>
-        </w:rPr>
-        <w:t>Hangyel</w:t>
-      </w:r>
-      <w:proofErr w:type="spellEnd"/>
-      <w:r>
-        <w:rPr>
-          <w:sz w:val="19"/>
-          <w:szCs w:val="19"/>
-        </w:rPr>
-        <w:t xml:space="preserve"> Kim, </w:t>
-      </w:r>
-      <w:proofErr w:type="spellStart"/>
-      <w:r>
-        <w:rPr>
-          <w:sz w:val="19"/>
-          <w:szCs w:val="19"/>
-        </w:rPr>
-        <w:t>Pinshane</w:t>
-      </w:r>
-      <w:proofErr w:type="spellEnd"/>
-      <w:r>
-        <w:rPr>
-          <w:sz w:val="19"/>
-          <w:szCs w:val="19"/>
-        </w:rPr>
-        <w:t xml:space="preserve"> Y. Huang, Arend M. van der Zande*, Miyoung Kim*, “Atomic Reconstruction in a Single-Twist </w:t>
-      </w:r>
-      <w:proofErr w:type="spellStart"/>
-      <w:r>
-        <w:rPr>
-          <w:sz w:val="19"/>
-          <w:szCs w:val="19"/>
-        </w:rPr>
-        <w:t>Trilayer</w:t>
-      </w:r>
-      <w:proofErr w:type="spellEnd"/>
-      <w:r>
-        <w:rPr>
-          <w:sz w:val="19"/>
-          <w:szCs w:val="19"/>
-        </w:rPr>
-        <w:t xml:space="preserve"> MoS2 on a CVD-Grown Bilayer”, The 21th International Microscopy Congress, Liverpool, United Kingdom (2026)</w:t>
+        <w:t>I. Yoo</w:t>
+      </w:r>
+      <w:r>
+        <w:rPr>
+          <w:sz w:val="19"/>
+          <w:szCs w:val="19"/>
+        </w:rPr>
+        <w:t>, Y.-C. Joo, M. Kim*, “A machine-learning approach to characterization of amorphous materials with EELS-SI and 4D-STEM”, 2022 Materials Research Society Spring Meeting, Hawaii, USA (2022)</w:t>
       </w:r>
     </w:p>
     <w:p>
@@ -2148,16 +2257,29 @@
         </w:numPr>
         <w:spacing w:after="46" w:line="248" w:lineRule="auto"/>
         <w:jc w:val="both"/>
-        <w:rPr>
-          <w:rFonts w:hint="eastAsia"/>
-        </w:rPr>
-      </w:pPr>
-      <w:r>
-        <w:rPr>
-          <w:sz w:val="19"/>
-          <w:szCs w:val="19"/>
-        </w:rPr>
-        <w:t xml:space="preserve">(Invited Talk) </w:t>
+      </w:pPr>
+      <w:r>
+        <w:rPr>
+          <w:sz w:val="19"/>
+          <w:szCs w:val="19"/>
+        </w:rPr>
+        <w:t xml:space="preserve">(Oral) </w:t>
+      </w:r>
+      <w:proofErr w:type="spellStart"/>
+      <w:r>
+        <w:rPr>
+          <w:sz w:val="19"/>
+          <w:szCs w:val="19"/>
+        </w:rPr>
+        <w:t>Yunyeong</w:t>
+      </w:r>
+      <w:proofErr w:type="spellEnd"/>
+      <w:r>
+        <w:rPr>
+          <w:sz w:val="19"/>
+          <w:szCs w:val="19"/>
+        </w:rPr>
+        <w:t xml:space="preserve"> Chang, </w:t>
       </w:r>
       <w:r>
         <w:rPr>
@@ -2174,55 +2296,7 @@
           <w:sz w:val="19"/>
           <w:szCs w:val="19"/>
         </w:rPr>
-        <w:t xml:space="preserve">, </w:t>
-      </w:r>
-      <w:proofErr w:type="spellStart"/>
-      <w:r>
-        <w:rPr>
-          <w:sz w:val="19"/>
-          <w:szCs w:val="19"/>
-        </w:rPr>
-        <w:t>Yunyeong</w:t>
-      </w:r>
-      <w:proofErr w:type="spellEnd"/>
-      <w:r>
-        <w:rPr>
-          <w:sz w:val="19"/>
-          <w:szCs w:val="19"/>
-        </w:rPr>
-        <w:t xml:space="preserve"> Chang, </w:t>
-      </w:r>
-      <w:proofErr w:type="spellStart"/>
-      <w:r>
-        <w:rPr>
-          <w:sz w:val="19"/>
-          <w:szCs w:val="19"/>
-        </w:rPr>
-        <w:t>Jinseok</w:t>
-      </w:r>
-      <w:proofErr w:type="spellEnd"/>
-      <w:r>
-        <w:rPr>
-          <w:sz w:val="19"/>
-          <w:szCs w:val="19"/>
-        </w:rPr>
-        <w:t xml:space="preserve"> Ryu, Jinwoo Kim, Seong Chul Hong, Ji-Hwan Baek, </w:t>
-      </w:r>
-      <w:proofErr w:type="spellStart"/>
-      <w:r>
-        <w:rPr>
-          <w:sz w:val="19"/>
-          <w:szCs w:val="19"/>
-        </w:rPr>
-        <w:t>Jaewoong</w:t>
-      </w:r>
-      <w:proofErr w:type="spellEnd"/>
-      <w:r>
-        <w:rPr>
-          <w:sz w:val="19"/>
-          <w:szCs w:val="19"/>
-        </w:rPr>
-        <w:t xml:space="preserve"> Joo, Jian-min Zuo, </w:t>
+        <w:t xml:space="preserve">, Ayoung Yuk, </w:t>
       </w:r>
       <w:proofErr w:type="spellStart"/>
       <w:r>
@@ -2238,22 +2312,7 @@
           <w:sz w:val="19"/>
           <w:szCs w:val="19"/>
         </w:rPr>
-        <w:t xml:space="preserve"> Yoo, Gwan-Hyoung Lee,</w:t>
-      </w:r>
-      <w:r>
-        <w:rPr>
-          <w:rFonts w:hint="eastAsia"/>
-          <w:sz w:val="19"/>
-          <w:szCs w:val="19"/>
-        </w:rPr>
-        <w:t xml:space="preserve"> </w:t>
-      </w:r>
-      <w:r>
-        <w:rPr>
-          <w:sz w:val="19"/>
-          <w:szCs w:val="19"/>
-        </w:rPr>
-        <w:t>Miyoung Kim*, “Interlayer lattice relaxation and moiré structural evolution in TMDs”, The 21th International Microscopy Congress, Liverpool, United Kingdom (2026)</w:t>
+        <w:t xml:space="preserve"> Yoo, Miyoung Kim*, “Understanding Twisted Transition Metal Dichalcogenide Domain Node Atomic Transition”, 2022 Materials Research Society Spring Meeting, Hawaii, USA (2022)</w:t>
       </w:r>
     </w:p>
     <w:p>

</xml_diff>

<commit_message>
fix: list IMC 2026 trilayer MoS2 presentation as a poster
Move the "Atomic Reconstruction in a Single-Twist Trilayer MoS2 on a
CVD-Grown Bilayer" entry from Oral into a new Poster group under
"As Presenter", in both publications.html and the CV (docx + regenerated
PDF). Also repair malformed closing span tags in two list entries.

Co-Authored-By: Claude Opus 5 <noreply@anthropic.com>
Claude-Session: https://claude.ai/code/session_01F8QtaySB59eHrhUhYgFqLs
</commit_message>
<xml_diff>
--- a/CV_Ingyu_Yoo.docx
+++ b/CV_Ingyu_Yoo.docx
@@ -1581,55 +1581,23 @@
           <w:sz w:val="19"/>
           <w:szCs w:val="19"/>
         </w:rPr>
-        <w:t xml:space="preserve">, </w:t>
-      </w:r>
-      <w:proofErr w:type="spellStart"/>
-      <w:r>
-        <w:rPr>
-          <w:sz w:val="19"/>
-          <w:szCs w:val="19"/>
-        </w:rPr>
-        <w:t>Hangyel</w:t>
-      </w:r>
-      <w:proofErr w:type="spellEnd"/>
-      <w:r>
-        <w:rPr>
-          <w:sz w:val="19"/>
-          <w:szCs w:val="19"/>
-        </w:rPr>
-        <w:t xml:space="preserve"> Kim, </w:t>
-      </w:r>
-      <w:proofErr w:type="spellStart"/>
-      <w:r>
-        <w:rPr>
-          <w:sz w:val="19"/>
-          <w:szCs w:val="19"/>
-        </w:rPr>
-        <w:t>Pinshane</w:t>
-      </w:r>
-      <w:proofErr w:type="spellEnd"/>
-      <w:r>
-        <w:rPr>
-          <w:sz w:val="19"/>
-          <w:szCs w:val="19"/>
-        </w:rPr>
-        <w:t xml:space="preserve"> Y. Huang, Arend M. van der Zande*, Miyoung Kim*, “Atomic Reconstruction in a Single-Twist </w:t>
-      </w:r>
-      <w:proofErr w:type="spellStart"/>
-      <w:r>
-        <w:rPr>
-          <w:sz w:val="19"/>
-          <w:szCs w:val="19"/>
-        </w:rPr>
-        <w:t>Trilayer</w:t>
-      </w:r>
-      <w:proofErr w:type="spellEnd"/>
-      <w:r>
-        <w:rPr>
-          <w:sz w:val="19"/>
-          <w:szCs w:val="19"/>
-        </w:rPr>
-        <w:t xml:space="preserve"> MoS2 on a CVD-Grown Bilayer”, The 21th International Microscopy Congress, Liverpool, United Kingdom (2026)</w:t>
+        <w:t xml:space="preserve">, Jinwoo Kim, </w:t>
+      </w:r>
+      <w:proofErr w:type="spellStart"/>
+      <w:r>
+        <w:rPr>
+          <w:sz w:val="19"/>
+          <w:szCs w:val="19"/>
+        </w:rPr>
+        <w:t>Jaewoong</w:t>
+      </w:r>
+      <w:proofErr w:type="spellEnd"/>
+      <w:r>
+        <w:rPr>
+          <w:sz w:val="19"/>
+          <w:szCs w:val="19"/>
+        </w:rPr>
+        <w:t xml:space="preserve"> Joo, Gwan-Hyoung Lee, Miyoung Kim*, “Deciphering Moiré Periodicity Modification in van der Waals Heterostructure”, Microscopy and Microanalysis 2025, Salt Lake City, USA (2025)</w:t>
       </w:r>
     </w:p>
     <w:p>
@@ -1679,7 +1647,7 @@
           <w:sz w:val="19"/>
           <w:szCs w:val="19"/>
         </w:rPr>
-        <w:t xml:space="preserve"> Joo, Gwan-Hyoung Lee, Miyoung Kim*, “Deciphering Moiré Periodicity Modification in van der Waals Heterostructure”, Microscopy and Microanalysis 2025, Salt Lake City, USA (2025)</w:t>
+        <w:t xml:space="preserve"> Joo, Gwan-Hyoung Lee, Miyoung Kim*, “Structural Responses to Interlayer Coupling in Aligned Heterostructure”, 13th Asia-Pacific Microscopy Congress, Brisbane, Australia (2025)</w:t>
       </w:r>
     </w:p>
     <w:p>
@@ -1713,23 +1681,39 @@
           <w:sz w:val="19"/>
           <w:szCs w:val="19"/>
         </w:rPr>
-        <w:t xml:space="preserve">, Jinwoo Kim, </w:t>
-      </w:r>
-      <w:proofErr w:type="spellStart"/>
-      <w:r>
-        <w:rPr>
-          <w:sz w:val="19"/>
-          <w:szCs w:val="19"/>
-        </w:rPr>
-        <w:t>Jaewoong</w:t>
-      </w:r>
-      <w:proofErr w:type="spellEnd"/>
-      <w:r>
-        <w:rPr>
-          <w:sz w:val="19"/>
-          <w:szCs w:val="19"/>
-        </w:rPr>
-        <w:t xml:space="preserve"> Joo, Gwan-Hyoung Lee, Miyoung Kim*, “Structural Responses to Interlayer Coupling in Aligned Heterostructure”, 13th Asia-Pacific Microscopy Congress, Brisbane, Australia (2025)</w:t>
+        <w:t xml:space="preserve">, </w:t>
+      </w:r>
+      <w:proofErr w:type="spellStart"/>
+      <w:r>
+        <w:rPr>
+          <w:sz w:val="19"/>
+          <w:szCs w:val="19"/>
+        </w:rPr>
+        <w:t>Yoonsang</w:t>
+      </w:r>
+      <w:proofErr w:type="spellEnd"/>
+      <w:r>
+        <w:rPr>
+          <w:sz w:val="19"/>
+          <w:szCs w:val="19"/>
+        </w:rPr>
+        <w:t xml:space="preserve"> Tak, </w:t>
+      </w:r>
+      <w:proofErr w:type="spellStart"/>
+      <w:r>
+        <w:rPr>
+          <w:sz w:val="19"/>
+          <w:szCs w:val="19"/>
+        </w:rPr>
+        <w:t>Jongho</w:t>
+      </w:r>
+      <w:proofErr w:type="spellEnd"/>
+      <w:r>
+        <w:rPr>
+          <w:sz w:val="19"/>
+          <w:szCs w:val="19"/>
+        </w:rPr>
+        <w:t xml:space="preserve"> Lee, Mireu Kim, Miyoung Kim*, “Quantitative Atomic Structure Analysis Using Saliency-Based Clustering in STEM”, 13th Asia-Pacific Microscopy Congress, Brisbane, Australia (2025)</w:t>
       </w:r>
     </w:p>
     <w:p>
@@ -1763,39 +1747,7 @@
           <w:sz w:val="19"/>
           <w:szCs w:val="19"/>
         </w:rPr>
-        <w:t xml:space="preserve">, </w:t>
-      </w:r>
-      <w:proofErr w:type="spellStart"/>
-      <w:r>
-        <w:rPr>
-          <w:sz w:val="19"/>
-          <w:szCs w:val="19"/>
-        </w:rPr>
-        <w:t>Yoonsang</w:t>
-      </w:r>
-      <w:proofErr w:type="spellEnd"/>
-      <w:r>
-        <w:rPr>
-          <w:sz w:val="19"/>
-          <w:szCs w:val="19"/>
-        </w:rPr>
-        <w:t xml:space="preserve"> Tak, </w:t>
-      </w:r>
-      <w:proofErr w:type="spellStart"/>
-      <w:r>
-        <w:rPr>
-          <w:sz w:val="19"/>
-          <w:szCs w:val="19"/>
-        </w:rPr>
-        <w:t>Jongho</w:t>
-      </w:r>
-      <w:proofErr w:type="spellEnd"/>
-      <w:r>
-        <w:rPr>
-          <w:sz w:val="19"/>
-          <w:szCs w:val="19"/>
-        </w:rPr>
-        <w:t xml:space="preserve"> Lee, Mireu Kim, Miyoung Kim*, “Quantitative Atomic Structure Analysis Using Saliency-Based Clustering in STEM”, 13th Asia-Pacific Microscopy Congress, Brisbane, Australia (2025)</w:t>
+        <w:t>, Jinwoo Kim, Gwan-Hyoung Lee, Miyoung Kim*, “Determination of Stacking Sequence and its correlation to properties on Multi-Layer Transition Metal Dichalcogenides”, 2024 Materials Research Society Fall Meeting, Boston, USA (2024)</w:t>
       </w:r>
     </w:p>
     <w:p>
@@ -1829,7 +1781,7 @@
           <w:sz w:val="19"/>
           <w:szCs w:val="19"/>
         </w:rPr>
-        <w:t>, Jinwoo Kim, Gwan-Hyoung Lee, Miyoung Kim*, “Determination of Stacking Sequence and its correlation to properties on Multi-Layer Transition Metal Dichalcogenides”, 2024 Materials Research Society Fall Meeting, Boston, USA (2024)</w:t>
+        <w:t>, Miyoung Kim*, “Diverse Stacking Sequences Discovery in Transition Metal Dichalcogenides (TMDs) through Diffraction Polarity Analysis”, The 2024 Annual Spring Conference of Korean Society of Microscopy, Hongcheon, South Korea (2024)</w:t>
       </w:r>
     </w:p>
     <w:p>
@@ -1863,7 +1815,57 @@
           <w:sz w:val="19"/>
           <w:szCs w:val="19"/>
         </w:rPr>
-        <w:t>, Miyoung Kim*, “Diverse Stacking Sequences Discovery in Transition Metal Dichalcogenides (TMDs) through Diffraction Polarity Analysis”, The 2024 Annual Spring Conference of Korean Society of Microscopy, Hongcheon, South Korea (2024)</w:t>
+        <w:t xml:space="preserve">, Jinwoo Kim, </w:t>
+      </w:r>
+      <w:proofErr w:type="spellStart"/>
+      <w:r>
+        <w:rPr>
+          <w:sz w:val="19"/>
+          <w:szCs w:val="19"/>
+        </w:rPr>
+        <w:t>Jusang</w:t>
+      </w:r>
+      <w:proofErr w:type="spellEnd"/>
+      <w:r>
+        <w:rPr>
+          <w:sz w:val="19"/>
+          <w:szCs w:val="19"/>
+        </w:rPr>
+        <w:t xml:space="preserve"> Lee, Gwan-Hyoung Lee, Miyoung Kim*, “Unraveling stacking </w:t>
+      </w:r>
+      <w:proofErr w:type="spellStart"/>
+      <w:r>
+        <w:rPr>
+          <w:sz w:val="19"/>
+          <w:szCs w:val="19"/>
+        </w:rPr>
+        <w:t>seqeunce</w:t>
+      </w:r>
+      <w:proofErr w:type="spellEnd"/>
+      <w:r>
+        <w:rPr>
+          <w:sz w:val="19"/>
+          <w:szCs w:val="19"/>
+        </w:rPr>
+        <w:t xml:space="preserve"> of WSe2 spiral structure using nanobeam diffraction”, The 20th International Microscopy Congress, Busan, South Korea (2023)</w:t>
+      </w:r>
+    </w:p>
+    <w:p>
+      <w:pPr>
+        <w:spacing w:before="140" w:after="60"/>
+        <w:ind w:left="200"/>
+      </w:pPr>
+      <w:r>
+        <w:rPr>
+          <w:b/>
+          <w:bCs/>
+          <w:i/>
+          <w:color w:val="595959"/>
+          <w:spacing w:val="20"/>
+          <w:sz w:val="18"/>
+          <w:szCs w:val="18"/>
+        </w:rPr>
+        <w:t>Poster</w:t>
       </w:r>
     </w:p>
     <w:p>
@@ -1897,39 +1899,55 @@
           <w:sz w:val="19"/>
           <w:szCs w:val="19"/>
         </w:rPr>
-        <w:t xml:space="preserve">, Jinwoo Kim, </w:t>
-      </w:r>
-      <w:proofErr w:type="spellStart"/>
-      <w:r>
-        <w:rPr>
-          <w:sz w:val="19"/>
-          <w:szCs w:val="19"/>
-        </w:rPr>
-        <w:t>Jusang</w:t>
-      </w:r>
-      <w:proofErr w:type="spellEnd"/>
-      <w:r>
-        <w:rPr>
-          <w:sz w:val="19"/>
-          <w:szCs w:val="19"/>
-        </w:rPr>
-        <w:t xml:space="preserve"> Lee, Gwan-Hyoung Lee, Miyoung Kim*, “Unraveling stacking </w:t>
-      </w:r>
-      <w:proofErr w:type="spellStart"/>
-      <w:r>
-        <w:rPr>
-          <w:sz w:val="19"/>
-          <w:szCs w:val="19"/>
-        </w:rPr>
-        <w:t>seqeunce</w:t>
-      </w:r>
-      <w:proofErr w:type="spellEnd"/>
-      <w:r>
-        <w:rPr>
-          <w:sz w:val="19"/>
-          <w:szCs w:val="19"/>
-        </w:rPr>
-        <w:t xml:space="preserve"> of WSe2 spiral structure using nanobeam diffraction”, The 20th International Microscopy Congress, Busan, South Korea (2023)</w:t>
+        <w:t xml:space="preserve">, </w:t>
+      </w:r>
+      <w:proofErr w:type="spellStart"/>
+      <w:r>
+        <w:rPr>
+          <w:sz w:val="19"/>
+          <w:szCs w:val="19"/>
+        </w:rPr>
+        <w:t>Hangyel</w:t>
+      </w:r>
+      <w:proofErr w:type="spellEnd"/>
+      <w:r>
+        <w:rPr>
+          <w:sz w:val="19"/>
+          <w:szCs w:val="19"/>
+        </w:rPr>
+        <w:t xml:space="preserve"> Kim, </w:t>
+      </w:r>
+      <w:proofErr w:type="spellStart"/>
+      <w:r>
+        <w:rPr>
+          <w:sz w:val="19"/>
+          <w:szCs w:val="19"/>
+        </w:rPr>
+        <w:t>Pinshane</w:t>
+      </w:r>
+      <w:proofErr w:type="spellEnd"/>
+      <w:r>
+        <w:rPr>
+          <w:sz w:val="19"/>
+          <w:szCs w:val="19"/>
+        </w:rPr>
+        <w:t xml:space="preserve"> Y. Huang, Arend M. van der Zande*, Miyoung Kim*, “Atomic Reconstruction in a Single-Twist </w:t>
+      </w:r>
+      <w:proofErr w:type="spellStart"/>
+      <w:r>
+        <w:rPr>
+          <w:sz w:val="19"/>
+          <w:szCs w:val="19"/>
+        </w:rPr>
+        <w:t>Trilayer</w:t>
+      </w:r>
+      <w:proofErr w:type="spellEnd"/>
+      <w:r>
+        <w:rPr>
+          <w:sz w:val="19"/>
+          <w:szCs w:val="19"/>
+        </w:rPr>
+        <w:t xml:space="preserve"> MoS2 on a CVD-Grown Bilayer”, The 21th International Microscopy Congress, Liverpool, United Kingdom (2026)</w:t>
       </w:r>
     </w:p>
     <w:p>

</xml_diff>

<commit_message>
feat: split coursework projects out of programming skills
Keep "Data Analysis / Programming Skills" to the Python/C/C++ and
Neo4j/PostgreSQL lines, and move the EV battery multi-agent system and
the DQN prediction-market work under a new "Coursework Projects" group,
in both research.html and the CV (docx + regenerated PDF).

Co-Authored-By: Claude Opus 5 <noreply@anthropic.com>
Claude-Session: https://claude.ai/code/session_01F8QtaySB59eHrhUhYgFqLs
</commit_message>
<xml_diff>
--- a/CV_Ingyu_Yoo.docx
+++ b/CV_Ingyu_Yoo.docx
@@ -819,6 +819,24 @@
           <w:szCs w:val="19"/>
         </w:rPr>
         <w:t>Conducted relational data analysis with Neo4j and managed large-scale data using PostgreSQL queries</w:t>
+      </w:r>
+    </w:p>
+    <w:p>
+      <w:pPr>
+        <w:tabs>
+          <w:tab w:val="right" w:pos="10080"/>
+        </w:tabs>
+        <w:spacing w:before="96" w:after="16"/>
+      </w:pPr>
+      <w:r>
+        <w:rPr>
+          <w:b/>
+          <w:bCs/>
+          <w:color w:val="1A1A1A"/>
+          <w:sz w:val="21"/>
+          <w:szCs w:val="21"/>
+        </w:rPr>
+        <w:t>Coursework Projects</w:t>
       </w:r>
     </w:p>
     <w:p>

</xml_diff>